<commit_message>
docs: publish final Harness Log evidence
</commit_message>
<xml_diff>
--- a/1/app/output/Итоговый_отчет.docx
+++ b/1/app/output/Итоговый_отчет.docx
@@ -2824,10 +2824,1001 @@
     <w:p/>
     <w:p>
       <w:pPr>
+        <w:sectPr>
+          <w:pgSz w:w="11906" w:h="16838"/>
+          <w:pgMar w:top="1020" w:right="850" w:bottom="1020" w:left="1020" w:header="720" w:footer="720" w:gutter="0"/>
+          <w:cols w:space="720"/>
+          <w:docGrid w:linePitch="360"/>
+        </w:sectPr>
+      </w:pPr>
+    </w:p>
+    <w:p>
+      <w:pPr>
         <w:pStyle w:val="Heading1"/>
       </w:pPr>
       <w:r>
-        <w:t>5. Сверка Python и Excel</w:t>
+        <w:t>Harness Log — журнал реализации</w:t>
+      </w:r>
+    </w:p>
+    <w:p>
+      <w:r>
+        <w:t>Журнал содержит подтверждённые проблемы, причины, внесённые исправления и результаты повторной проверки модели.</w:t>
+      </w:r>
+    </w:p>
+    <w:tbl>
+      <w:tblPr>
+        <w:tblStyle w:val="TableGrid"/>
+        <w:tblW w:type="auto" w:w="0"/>
+        <w:jc w:val="center"/>
+        <w:tblLook w:firstColumn="1" w:firstRow="1" w:lastColumn="0" w:lastRow="0" w:noHBand="0" w:noVBand="1" w:val="04A0"/>
+      </w:tblPr>
+      <w:tblGrid>
+        <w:gridCol w:w="1935"/>
+        <w:gridCol w:w="1935"/>
+        <w:gridCol w:w="1935"/>
+        <w:gridCol w:w="1935"/>
+        <w:gridCol w:w="1935"/>
+        <w:gridCol w:w="1935"/>
+        <w:gridCol w:w="1935"/>
+        <w:gridCol w:w="1935"/>
+      </w:tblGrid>
+      <w:tr>
+        <w:trPr>
+          <w:tblHeader w:val="true"/>
+        </w:trPr>
+        <w:tc>
+          <w:tcPr>
+            <w:tcW w:type="dxa" w:w="1935"/>
+            <w:vAlign w:val="top"/>
+            <w:shd w:fill="1F4E78"/>
+          </w:tcPr>
+          <w:p>
+            <w:r>
+              <w:rPr>
+                <w:b/>
+                <w:color w:val="FFFFFF"/>
+                <w:sz w:val="16"/>
+              </w:rPr>
+              <w:t>№</w:t>
+            </w:r>
+          </w:p>
+        </w:tc>
+        <w:tc>
+          <w:tcPr>
+            <w:tcW w:type="dxa" w:w="1935"/>
+            <w:vAlign w:val="top"/>
+            <w:shd w:fill="1F4E78"/>
+          </w:tcPr>
+          <w:p>
+            <w:r>
+              <w:rPr>
+                <w:b/>
+                <w:color w:val="FFFFFF"/>
+                <w:sz w:val="16"/>
+              </w:rPr>
+              <w:t>Этап</w:t>
+            </w:r>
+          </w:p>
+        </w:tc>
+        <w:tc>
+          <w:tcPr>
+            <w:tcW w:type="dxa" w:w="1935"/>
+            <w:vAlign w:val="top"/>
+            <w:shd w:fill="1F4E78"/>
+          </w:tcPr>
+          <w:p>
+            <w:r>
+              <w:rPr>
+                <w:b/>
+                <w:color w:val="FFFFFF"/>
+                <w:sz w:val="16"/>
+              </w:rPr>
+              <w:t>Запрос к ИИ / задача</w:t>
+            </w:r>
+          </w:p>
+        </w:tc>
+        <w:tc>
+          <w:tcPr>
+            <w:tcW w:type="dxa" w:w="1935"/>
+            <w:vAlign w:val="top"/>
+            <w:shd w:fill="1F4E78"/>
+          </w:tcPr>
+          <w:p>
+            <w:r>
+              <w:rPr>
+                <w:b/>
+                <w:color w:val="FFFFFF"/>
+                <w:sz w:val="16"/>
+              </w:rPr>
+              <w:t>Сгенерированный или изменённый фрагмент кода</w:t>
+            </w:r>
+          </w:p>
+        </w:tc>
+        <w:tc>
+          <w:tcPr>
+            <w:tcW w:type="dxa" w:w="1935"/>
+            <w:vAlign w:val="top"/>
+            <w:shd w:fill="1F4E78"/>
+          </w:tcPr>
+          <w:p>
+            <w:r>
+              <w:rPr>
+                <w:b/>
+                <w:color w:val="FFFFFF"/>
+                <w:sz w:val="16"/>
+              </w:rPr>
+              <w:t>Обнаруженная ошибка / галлюцинация</w:t>
+            </w:r>
+          </w:p>
+        </w:tc>
+        <w:tc>
+          <w:tcPr>
+            <w:tcW w:type="dxa" w:w="1935"/>
+            <w:vAlign w:val="top"/>
+            <w:shd w:fill="1F4E78"/>
+          </w:tcPr>
+          <w:p>
+            <w:r>
+              <w:rPr>
+                <w:b/>
+                <w:color w:val="FFFFFF"/>
+                <w:sz w:val="16"/>
+              </w:rPr>
+              <w:t>Причина</w:t>
+            </w:r>
+          </w:p>
+        </w:tc>
+        <w:tc>
+          <w:tcPr>
+            <w:tcW w:type="dxa" w:w="1935"/>
+            <w:vAlign w:val="top"/>
+            <w:shd w:fill="1F4E78"/>
+          </w:tcPr>
+          <w:p>
+            <w:r>
+              <w:rPr>
+                <w:b/>
+                <w:color w:val="FFFFFF"/>
+                <w:sz w:val="16"/>
+              </w:rPr>
+              <w:t>Как исправлено</w:t>
+            </w:r>
+          </w:p>
+        </w:tc>
+        <w:tc>
+          <w:tcPr>
+            <w:tcW w:type="dxa" w:w="1935"/>
+            <w:vAlign w:val="top"/>
+            <w:shd w:fill="1F4E78"/>
+          </w:tcPr>
+          <w:p>
+            <w:r>
+              <w:rPr>
+                <w:b/>
+                <w:color w:val="FFFFFF"/>
+                <w:sz w:val="16"/>
+              </w:rPr>
+              <w:t>Результат повторной проверки</w:t>
+            </w:r>
+          </w:p>
+        </w:tc>
+      </w:tr>
+      <w:tr>
+        <w:tc>
+          <w:tcPr>
+            <w:tcW w:type="dxa" w:w="1935"/>
+            <w:vAlign w:val="top"/>
+          </w:tcPr>
+          <w:p>
+            <w:r>
+              <w:rPr>
+                <w:sz w:val="16"/>
+              </w:rPr>
+              <w:t>1</w:t>
+            </w:r>
+          </w:p>
+        </w:tc>
+        <w:tc>
+          <w:tcPr>
+            <w:tcW w:type="dxa" w:w="1935"/>
+            <w:vAlign w:val="top"/>
+          </w:tcPr>
+          <w:p>
+            <w:r>
+              <w:rPr>
+                <w:sz w:val="16"/>
+              </w:rPr>
+              <w:t>Аудит показателей качества</w:t>
+            </w:r>
+          </w:p>
+        </w:tc>
+        <w:tc>
+          <w:tcPr>
+            <w:tcW w:type="dxa" w:w="1935"/>
+            <w:vAlign w:val="top"/>
+          </w:tcPr>
+          <w:p>
+            <w:r>
+              <w:rPr>
+                <w:sz w:val="16"/>
+              </w:rPr>
+              <w:t>Развести FPY и итоговый выход годных</w:t>
+            </w:r>
+          </w:p>
+        </w:tc>
+        <w:tc>
+          <w:tcPr>
+            <w:tcW w:type="dxa" w:w="1935"/>
+            <w:vAlign w:val="top"/>
+          </w:tcPr>
+          <w:p>
+            <w:r>
+              <w:rPr>
+                <w:sz w:val="16"/>
+              </w:rPr>
+              <w:t>fpy = first_pass_good_units / actual_output; final_yield = final_good_units / actual_output</w:t>
+            </w:r>
+          </w:p>
+        </w:tc>
+        <w:tc>
+          <w:tcPr>
+            <w:tcW w:type="dxa" w:w="1935"/>
+            <w:vAlign w:val="top"/>
+          </w:tcPr>
+          <w:p>
+            <w:r>
+              <w:rPr>
+                <w:sz w:val="16"/>
+              </w:rPr>
+              <w:t>FPY и Final Yield могли быть ошибочно приняты за один показатель</w:t>
+            </w:r>
+          </w:p>
+        </w:tc>
+        <w:tc>
+          <w:tcPr>
+            <w:tcW w:type="dxa" w:w="1935"/>
+            <w:vAlign w:val="top"/>
+          </w:tcPr>
+          <w:p>
+            <w:r>
+              <w:rPr>
+                <w:sz w:val="16"/>
+              </w:rPr>
+              <w:t>Итоговый годный объём включает продукцию после переделки</w:t>
+            </w:r>
+          </w:p>
+        </w:tc>
+        <w:tc>
+          <w:tcPr>
+            <w:tcW w:type="dxa" w:w="1935"/>
+            <w:vAlign w:val="top"/>
+          </w:tcPr>
+          <w:p>
+            <w:r>
+              <w:rPr>
+                <w:sz w:val="16"/>
+              </w:rPr>
+              <w:t>Показатели реализованы и раскрыты раздельно</w:t>
+            </w:r>
+          </w:p>
+        </w:tc>
+        <w:tc>
+          <w:tcPr>
+            <w:tcW w:type="dxa" w:w="1935"/>
+            <w:vAlign w:val="top"/>
+          </w:tcPr>
+          <w:p>
+            <w:r>
+              <w:rPr>
+                <w:sz w:val="16"/>
+              </w:rPr>
+              <w:t>Тест подтверждает FPY 75 %, Final Yield 85 %</w:t>
+            </w:r>
+          </w:p>
+        </w:tc>
+      </w:tr>
+      <w:tr>
+        <w:tc>
+          <w:tcPr>
+            <w:tcW w:type="dxa" w:w="1935"/>
+            <w:vAlign w:val="top"/>
+          </w:tcPr>
+          <w:p>
+            <w:r>
+              <w:rPr>
+                <w:sz w:val="16"/>
+              </w:rPr>
+              <w:t>2</w:t>
+            </w:r>
+          </w:p>
+        </w:tc>
+        <w:tc>
+          <w:tcPr>
+            <w:tcW w:type="dxa" w:w="1935"/>
+            <w:vAlign w:val="top"/>
+          </w:tcPr>
+          <w:p>
+            <w:r>
+              <w:rPr>
+                <w:sz w:val="16"/>
+              </w:rPr>
+              <w:t>Аудит параметров TTM</w:t>
+            </w:r>
+          </w:p>
+        </w:tc>
+        <w:tc>
+          <w:tcPr>
+            <w:tcW w:type="dxa" w:w="1935"/>
+            <w:vAlign w:val="top"/>
+          </w:tcPr>
+          <w:p>
+            <w:r>
+              <w:rPr>
+                <w:sz w:val="16"/>
+              </w:rPr>
+              <w:t>Сопоставить параметры задания и CSV</w:t>
+            </w:r>
+          </w:p>
+        </w:tc>
+        <w:tc>
+          <w:tcPr>
+            <w:tcW w:type="dxa" w:w="1935"/>
+            <w:vAlign w:val="top"/>
+          </w:tcPr>
+          <w:p>
+            <w:r>
+              <w:rPr>
+                <w:sz w:val="16"/>
+              </w:rPr>
+              <w:t>assignment_ttm = ttm.calculate(delay, 0.10, 0.15, 3.0, window)</w:t>
+            </w:r>
+          </w:p>
+        </w:tc>
+        <w:tc>
+          <w:tcPr>
+            <w:tcW w:type="dxa" w:w="1935"/>
+            <w:vAlign w:val="top"/>
+          </w:tcPr>
+          <w:p>
+            <w:r>
+              <w:rPr>
+                <w:sz w:val="16"/>
+              </w:rPr>
+              <w:t>В задании r=10 %, α=15 %, а в CSV r=12 %, α=18 %</w:t>
+            </w:r>
+          </w:p>
+        </w:tc>
+        <w:tc>
+          <w:tcPr>
+            <w:tcW w:type="dxa" w:w="1935"/>
+            <w:vAlign w:val="top"/>
+          </w:tcPr>
+          <w:p>
+            <w:r>
+              <w:rPr>
+                <w:sz w:val="16"/>
+              </w:rPr>
+              <w:t>Исходные материалы задают разные сценарии</w:t>
+            </w:r>
+          </w:p>
+        </w:tc>
+        <w:tc>
+          <w:tcPr>
+            <w:tcW w:type="dxa" w:w="1935"/>
+            <w:vAlign w:val="top"/>
+          </w:tcPr>
+          <w:p>
+            <w:r>
+              <w:rPr>
+                <w:sz w:val="16"/>
+              </w:rPr>
+              <w:t>Оба сценария рассчитаны и раскрыты отдельно</w:t>
+            </w:r>
+          </w:p>
+        </w:tc>
+        <w:tc>
+          <w:tcPr>
+            <w:tcW w:type="dxa" w:w="1935"/>
+            <w:vAlign w:val="top"/>
+          </w:tcPr>
+          <w:p>
+            <w:r>
+              <w:rPr>
+                <w:sz w:val="16"/>
+              </w:rPr>
+              <w:t>Получены штрафы 26,285941 % и 28,034684 % без подмены параметров</w:t>
+            </w:r>
+          </w:p>
+        </w:tc>
+      </w:tr>
+      <w:tr>
+        <w:tc>
+          <w:tcPr>
+            <w:tcW w:type="dxa" w:w="1935"/>
+            <w:vAlign w:val="top"/>
+          </w:tcPr>
+          <w:p>
+            <w:r>
+              <w:rPr>
+                <w:sz w:val="16"/>
+              </w:rPr>
+              <w:t>3</w:t>
+            </w:r>
+          </w:p>
+        </w:tc>
+        <w:tc>
+          <w:tcPr>
+            <w:tcW w:type="dxa" w:w="1935"/>
+            <w:vAlign w:val="top"/>
+          </w:tcPr>
+          <w:p>
+            <w:r>
+              <w:rPr>
+                <w:sz w:val="16"/>
+              </w:rPr>
+              <w:t>Стресс-сценарий TTM</w:t>
+            </w:r>
+          </w:p>
+        </w:tc>
+        <w:tc>
+          <w:tcPr>
+            <w:tcW w:type="dxa" w:w="1935"/>
+            <w:vAlign w:val="top"/>
+          </w:tcPr>
+          <w:p>
+            <w:r>
+              <w:rPr>
+                <w:sz w:val="16"/>
+              </w:rPr>
+              <w:t>Выбрать корректную базовую задержку</w:t>
+            </w:r>
+          </w:p>
+        </w:tc>
+        <w:tc>
+          <w:tcPr>
+            <w:tcW w:type="dxa" w:w="1935"/>
+            <w:vAlign w:val="top"/>
+          </w:tcPr>
+          <w:p>
+            <w:r>
+              <w:rPr>
+                <w:sz w:val="16"/>
+              </w:rPr>
+              <w:t>baseline_stress_ttm = ttm.calculate(comparison.delay[0], 0.10, 0.15, 3.0, window)</w:t>
+            </w:r>
+          </w:p>
+        </w:tc>
+        <w:tc>
+          <w:tcPr>
+            <w:tcW w:type="dxa" w:w="1935"/>
+            <w:vAlign w:val="top"/>
+          </w:tcPr>
+          <w:p>
+            <w:r>
+              <w:rPr>
+                <w:sz w:val="16"/>
+              </w:rPr>
+              <w:t>Pilot CSV содержит задержку 0,5 года, comparison baseline — 0 лет</w:t>
+            </w:r>
+          </w:p>
+        </w:tc>
+        <w:tc>
+          <w:tcPr>
+            <w:tcW w:type="dxa" w:w="1935"/>
+            <w:vAlign w:val="top"/>
+          </w:tcPr>
+          <w:p>
+            <w:r>
+              <w:rPr>
+                <w:sz w:val="16"/>
+              </w:rPr>
+              <w:t>Pilot и сравнительный baseline имеют разное назначение</w:t>
+            </w:r>
+          </w:p>
+        </w:tc>
+        <w:tc>
+          <w:tcPr>
+            <w:tcW w:type="dxa" w:w="1935"/>
+            <w:vAlign w:val="top"/>
+          </w:tcPr>
+          <w:p>
+            <w:r>
+              <w:rPr>
+                <w:sz w:val="16"/>
+              </w:rPr>
+              <w:t>Для стресс-сравнения использован baseline comparison CSV</w:t>
+            </w:r>
+          </w:p>
+        </w:tc>
+        <w:tc>
+          <w:tcPr>
+            <w:tcW w:type="dxa" w:w="1935"/>
+            <w:vAlign w:val="top"/>
+          </w:tcPr>
+          <w:p>
+            <w:r>
+              <w:rPr>
+                <w:sz w:val="16"/>
+              </w:rPr>
+              <w:t>Тест подтверждает изменение штрафа TTM с 0 % до 26,285941 %</w:t>
+            </w:r>
+          </w:p>
+        </w:tc>
+      </w:tr>
+      <w:tr>
+        <w:tc>
+          <w:tcPr>
+            <w:tcW w:type="dxa" w:w="1935"/>
+            <w:vAlign w:val="top"/>
+          </w:tcPr>
+          <w:p>
+            <w:r>
+              <w:rPr>
+                <w:sz w:val="16"/>
+              </w:rPr>
+              <w:t>4</w:t>
+            </w:r>
+          </w:p>
+        </w:tc>
+        <w:tc>
+          <w:tcPr>
+            <w:tcW w:type="dxa" w:w="1935"/>
+            <w:vAlign w:val="top"/>
+          </w:tcPr>
+          <w:p>
+            <w:r>
+              <w:rPr>
+                <w:sz w:val="16"/>
+              </w:rPr>
+              <w:t>Аудит ресурсоёмкости</w:t>
+            </w:r>
+          </w:p>
+        </w:tc>
+        <w:tc>
+          <w:tcPr>
+            <w:tcW w:type="dxa" w:w="1935"/>
+            <w:vAlign w:val="top"/>
+          </w:tcPr>
+          <w:p>
+            <w:r>
+              <w:rPr>
+                <w:sz w:val="16"/>
+              </w:rPr>
+              <w:t>Проверить вычислимость массовой ресурсоёмкости</w:t>
+            </w:r>
+          </w:p>
+        </w:tc>
+        <w:tc>
+          <w:tcPr>
+            <w:tcW w:type="dxa" w:w="1935"/>
+            <w:vAlign w:val="top"/>
+          </w:tcPr>
+          <w:p>
+            <w:r>
+              <w:rPr>
+                <w:sz w:val="16"/>
+              </w:rPr>
+              <w:t>mass_intensity = NOT_COMPUTABLE</w:t>
+            </w:r>
+          </w:p>
+        </w:tc>
+        <w:tc>
+          <w:tcPr>
+            <w:tcW w:type="dxa" w:w="1935"/>
+            <w:vAlign w:val="top"/>
+          </w:tcPr>
+          <w:p>
+            <w:r>
+              <w:rPr>
+                <w:sz w:val="16"/>
+              </w:rPr>
+              <w:t>Масса сырья отсутствует, а стоимость не может заменить массу</w:t>
+            </w:r>
+          </w:p>
+        </w:tc>
+        <w:tc>
+          <w:tcPr>
+            <w:tcW w:type="dxa" w:w="1935"/>
+            <w:vAlign w:val="top"/>
+          </w:tcPr>
+          <w:p>
+            <w:r>
+              <w:rPr>
+                <w:sz w:val="16"/>
+              </w:rPr>
+              <w:t>В CSV нет Raw_Material_Mass_kg</w:t>
+            </w:r>
+          </w:p>
+        </w:tc>
+        <w:tc>
+          <w:tcPr>
+            <w:tcW w:type="dxa" w:w="1935"/>
+            <w:vAlign w:val="top"/>
+          </w:tcPr>
+          <w:p>
+            <w:r>
+              <w:rPr>
+                <w:sz w:val="16"/>
+              </w:rPr>
+              <w:t>Метрика помечена НЕ РАССЧИТЫВАЕТСЯ, стоимостной proxy показан отдельно</w:t>
+            </w:r>
+          </w:p>
+        </w:tc>
+        <w:tc>
+          <w:tcPr>
+            <w:tcW w:type="dxa" w:w="1935"/>
+            <w:vAlign w:val="top"/>
+          </w:tcPr>
+          <w:p>
+            <w:r>
+              <w:rPr>
+                <w:sz w:val="16"/>
+              </w:rPr>
+              <w:t>Excel и Python одинаково фиксируют одно невычислимое значение</w:t>
+            </w:r>
+          </w:p>
+        </w:tc>
+      </w:tr>
+      <w:tr>
+        <w:tc>
+          <w:tcPr>
+            <w:tcW w:type="dxa" w:w="1935"/>
+            <w:vAlign w:val="top"/>
+          </w:tcPr>
+          <w:p>
+            <w:r>
+              <w:rPr>
+                <w:sz w:val="16"/>
+              </w:rPr>
+              <w:t>5</w:t>
+            </w:r>
+          </w:p>
+        </w:tc>
+        <w:tc>
+          <w:tcPr>
+            <w:tcW w:type="dxa" w:w="1935"/>
+            <w:vAlign w:val="top"/>
+          </w:tcPr>
+          <w:p>
+            <w:r>
+              <w:rPr>
+                <w:sz w:val="16"/>
+              </w:rPr>
+              <w:t>Пересчёт Excel</w:t>
+            </w:r>
+          </w:p>
+        </w:tc>
+        <w:tc>
+          <w:tcPr>
+            <w:tcW w:type="dxa" w:w="1935"/>
+            <w:vAlign w:val="top"/>
+          </w:tcPr>
+          <w:p>
+            <w:r>
+              <w:rPr>
+                <w:sz w:val="16"/>
+              </w:rPr>
+              <w:t>Получить кэшированные результаты формул</w:t>
+            </w:r>
+          </w:p>
+        </w:tc>
+        <w:tc>
+          <w:tcPr>
+            <w:tcW w:type="dxa" w:w="1935"/>
+            <w:vAlign w:val="top"/>
+          </w:tcPr>
+          <w:p>
+            <w:r>
+              <w:rPr>
+                <w:sz w:val="16"/>
+              </w:rPr>
+              <w:t>excel.CalculateFullRebuild(); workbook.Save()</w:t>
+            </w:r>
+          </w:p>
+        </w:tc>
+        <w:tc>
+          <w:tcPr>
+            <w:tcW w:type="dxa" w:w="1935"/>
+            <w:vAlign w:val="top"/>
+          </w:tcPr>
+          <w:p>
+            <w:r>
+              <w:rPr>
+                <w:sz w:val="16"/>
+              </w:rPr>
+              <w:t>openpyxl сохраняет формулы, но не вычисляет их</w:t>
+            </w:r>
+          </w:p>
+        </w:tc>
+        <w:tc>
+          <w:tcPr>
+            <w:tcW w:type="dxa" w:w="1935"/>
+            <w:vAlign w:val="top"/>
+          </w:tcPr>
+          <w:p>
+            <w:r>
+              <w:rPr>
+                <w:sz w:val="16"/>
+              </w:rPr>
+              <w:t>Библиотека не является движком Excel</w:t>
+            </w:r>
+          </w:p>
+        </w:tc>
+        <w:tc>
+          <w:tcPr>
+            <w:tcW w:type="dxa" w:w="1935"/>
+            <w:vAlign w:val="top"/>
+          </w:tcPr>
+          <w:p>
+            <w:r>
+              <w:rPr>
+                <w:sz w:val="16"/>
+              </w:rPr>
+              <w:t>Добавлен реальный пересчёт установленным Microsoft Excel</w:t>
+            </w:r>
+          </w:p>
+        </w:tc>
+        <w:tc>
+          <w:tcPr>
+            <w:tcW w:type="dxa" w:w="1935"/>
+            <w:vAlign w:val="top"/>
+          </w:tcPr>
+          <w:p>
+            <w:r>
+              <w:rPr>
+                <w:sz w:val="16"/>
+              </w:rPr>
+              <w:t>Из кэша прочитаны FPY 0,75, OEE 0,59375 и CPU 14 713,0374957</w:t>
+            </w:r>
+          </w:p>
+        </w:tc>
+      </w:tr>
+      <w:tr>
+        <w:tc>
+          <w:tcPr>
+            <w:tcW w:type="dxa" w:w="1935"/>
+            <w:vAlign w:val="top"/>
+          </w:tcPr>
+          <w:p>
+            <w:r>
+              <w:rPr>
+                <w:sz w:val="16"/>
+              </w:rPr>
+              <w:t>6</w:t>
+            </w:r>
+          </w:p>
+        </w:tc>
+        <w:tc>
+          <w:tcPr>
+            <w:tcW w:type="dxa" w:w="1935"/>
+            <w:vAlign w:val="top"/>
+          </w:tcPr>
+          <w:p>
+            <w:r>
+              <w:rPr>
+                <w:sz w:val="16"/>
+              </w:rPr>
+              <w:t>Жизненный цикл COM</w:t>
+            </w:r>
+          </w:p>
+        </w:tc>
+        <w:tc>
+          <w:tcPr>
+            <w:tcW w:type="dxa" w:w="1935"/>
+            <w:vAlign w:val="top"/>
+          </w:tcPr>
+          <w:p>
+            <w:r>
+              <w:rPr>
+                <w:sz w:val="16"/>
+              </w:rPr>
+              <w:t>Исключить сбой освобождения Excel COM</w:t>
+            </w:r>
+          </w:p>
+        </w:tc>
+        <w:tc>
+          <w:tcPr>
+            <w:tcW w:type="dxa" w:w="1935"/>
+            <w:vAlign w:val="top"/>
+          </w:tcPr>
+          <w:p>
+            <w:r>
+              <w:rPr>
+                <w:sz w:val="16"/>
+              </w:rPr>
+              <w:t>subprocess.run([sys.executable, excel_worker.py, workbook_path])</w:t>
+            </w:r>
+          </w:p>
+        </w:tc>
+        <w:tc>
+          <w:tcPr>
+            <w:tcW w:type="dxa" w:w="1935"/>
+            <w:vAlign w:val="top"/>
+          </w:tcPr>
+          <w:p>
+            <w:r>
+              <w:rPr>
+                <w:sz w:val="16"/>
+              </w:rPr>
+              <w:t>Первый интеграционный подход мог завершаться RPC_E_DISCONNECTED</w:t>
+            </w:r>
+          </w:p>
+        </w:tc>
+        <w:tc>
+          <w:tcPr>
+            <w:tcW w:type="dxa" w:w="1935"/>
+            <w:vAlign w:val="top"/>
+          </w:tcPr>
+          <w:p>
+            <w:r>
+              <w:rPr>
+                <w:sz w:val="16"/>
+              </w:rPr>
+              <w:t>COM-прокси переживали закрытие Excel в долгоживущем процессе</w:t>
+            </w:r>
+          </w:p>
+        </w:tc>
+        <w:tc>
+          <w:tcPr>
+            <w:tcW w:type="dxa" w:w="1935"/>
+            <w:vAlign w:val="top"/>
+          </w:tcPr>
+          <w:p>
+            <w:r>
+              <w:rPr>
+                <w:sz w:val="16"/>
+              </w:rPr>
+              <w:t>Пересчёт изолирован в короткоживущем worker-процессе</w:t>
+            </w:r>
+          </w:p>
+        </w:tc>
+        <w:tc>
+          <w:tcPr>
+            <w:tcW w:type="dxa" w:w="1935"/>
+            <w:vAlign w:val="top"/>
+          </w:tcPr>
+          <w:p>
+            <w:r>
+              <w:rPr>
+                <w:sz w:val="16"/>
+              </w:rPr>
+              <w:t>Интеграционный тест завершается без RPC fault и с корректным кэшем</w:t>
+            </w:r>
+          </w:p>
+        </w:tc>
+      </w:tr>
+      <w:tr>
+        <w:tc>
+          <w:tcPr>
+            <w:tcW w:type="dxa" w:w="1935"/>
+            <w:vAlign w:val="top"/>
+          </w:tcPr>
+          <w:p>
+            <w:r>
+              <w:rPr>
+                <w:sz w:val="16"/>
+              </w:rPr>
+              <w:t>7</w:t>
+            </w:r>
+          </w:p>
+        </w:tc>
+        <w:tc>
+          <w:tcPr>
+            <w:tcW w:type="dxa" w:w="1935"/>
+            <w:vAlign w:val="top"/>
+          </w:tcPr>
+          <w:p>
+            <w:r>
+              <w:rPr>
+                <w:sz w:val="16"/>
+              </w:rPr>
+              <w:t>Архитектура контрольных журналов</w:t>
+            </w:r>
+          </w:p>
+        </w:tc>
+        <w:tc>
+          <w:tcPr>
+            <w:tcW w:type="dxa" w:w="1935"/>
+            <w:vAlign w:val="top"/>
+          </w:tcPr>
+          <w:p>
+            <w:r>
+              <w:rPr>
+                <w:sz w:val="16"/>
+              </w:rPr>
+              <w:t>Развести журнал реализации и числовую сверку</w:t>
+            </w:r>
+          </w:p>
+        </w:tc>
+        <w:tc>
+          <w:tcPr>
+            <w:tcW w:type="dxa" w:w="1935"/>
+            <w:vAlign w:val="top"/>
+          </w:tcPr>
+          <w:p>
+            <w:r>
+              <w:rPr>
+                <w:sz w:val="16"/>
+              </w:rPr>
+              <w:t>implementation_log_entries и reconciliation_rows</w:t>
+            </w:r>
+          </w:p>
+        </w:tc>
+        <w:tc>
+          <w:tcPr>
+            <w:tcW w:type="dxa" w:w="1935"/>
+            <w:vAlign w:val="top"/>
+          </w:tcPr>
+          <w:p>
+            <w:r>
+              <w:rPr>
+                <w:sz w:val="16"/>
+              </w:rPr>
+              <w:t>Числовая сверка была ошибочно названа Harness Log</w:t>
+            </w:r>
+          </w:p>
+        </w:tc>
+        <w:tc>
+          <w:tcPr>
+            <w:tcW w:type="dxa" w:w="1935"/>
+            <w:vAlign w:val="top"/>
+          </w:tcPr>
+          <w:p>
+            <w:r>
+              <w:rPr>
+                <w:sz w:val="16"/>
+              </w:rPr>
+              <w:t>Два разных типа доказательств использовали одно название</w:t>
+            </w:r>
+          </w:p>
+        </w:tc>
+        <w:tc>
+          <w:tcPr>
+            <w:tcW w:type="dxa" w:w="1935"/>
+            <w:vAlign w:val="top"/>
+          </w:tcPr>
+          <w:p>
+            <w:r>
+              <w:rPr>
+                <w:sz w:val="16"/>
+              </w:rPr>
+              <w:t>Числовая проверка переименована в «Сверка Excel–Python», Harness Log выделен отдельно</w:t>
+            </w:r>
+          </w:p>
+        </w:tc>
+        <w:tc>
+          <w:tcPr>
+            <w:tcW w:type="dxa" w:w="1935"/>
+            <w:vAlign w:val="top"/>
+          </w:tcPr>
+          <w:p>
+            <w:r>
+              <w:rPr>
+                <w:sz w:val="16"/>
+              </w:rPr>
+              <w:t>Отчёты содержат два самостоятельных раздела и восемь обязательных артефактов</w:t>
+            </w:r>
+          </w:p>
+        </w:tc>
+      </w:tr>
+    </w:tbl>
+    <w:p/>
+    <w:p>
+      <w:pPr>
+        <w:sectPr>
+          <w:pgSz w:w="16838" w:h="11906" w:orient="landscape"/>
+          <w:pgMar w:top="680" w:right="680" w:bottom="680" w:left="680" w:header="720" w:footer="720" w:gutter="0"/>
+          <w:cols w:space="720"/>
+          <w:docGrid w:linePitch="360"/>
+        </w:sectPr>
+      </w:pPr>
+    </w:p>
+    <w:p>
+      <w:pPr>
+        <w:pStyle w:val="Heading1"/>
+      </w:pPr>
+      <w:r>
+        <w:t>5. Сверка Excel–Python</w:t>
       </w:r>
     </w:p>
     <w:p>

</xml_diff>